<commit_message>
Fill in authors, supervisor and the correct campus
Roll numbers added for all three authors, supervisor named as Dr. Manisha
Khulbe on both the deck title slide and the report title page, and on the
report's supervisor signature line.

The department PPT template names Dwarka; this project is at East Campus,
Geeta Colony, so the affiliation on both title pages now reads "Netaji Subhas
University of Technology, East Campus / Geeta Colony, New Delhi - 110031".
The same template also names Mechanical Engineering, corrected earlier.

No placeholder fields remain on either title page.

Co-Authored-By: Claude Opus 5 (1M context) <noreply@anthropic.com>
</commit_message>
<xml_diff>
--- a/End_Sem_Report_TEMPLATE.docx
+++ b/End_Sem_Report_TEMPLATE.docx
@@ -99,7 +99,7 @@
           <w:sz w:val="22"/>
           <w:szCs w:val="22"/>
         </w:rPr>
-        <w:t xml:space="preserve">   (Roll No. ________)</w:t>
+        <w:t xml:space="preserve">   (Roll No. 2023UEA7232)</w:t>
       </w:r>
     </w:p>
     <w:p>
@@ -123,7 +123,7 @@
           <w:sz w:val="22"/>
           <w:szCs w:val="22"/>
         </w:rPr>
-        <w:t xml:space="preserve">   (Roll No. ________)</w:t>
+        <w:t xml:space="preserve">   (Roll No. 2023UEA7225)</w:t>
       </w:r>
     </w:p>
     <w:p>
@@ -147,7 +147,7 @@
           <w:sz w:val="22"/>
           <w:szCs w:val="22"/>
         </w:rPr>
-        <w:t xml:space="preserve">   (Roll No. ________)</w:t>
+        <w:t xml:space="preserve">   (Roll No. 2023UEA6603)</w:t>
       </w:r>
     </w:p>
     <w:p>
@@ -177,7 +177,7 @@
           <w:sz w:val="26"/>
           <w:szCs w:val="26"/>
         </w:rPr>
-        <w:t xml:space="preserve">____________________________</w:t>
+        <w:t xml:space="preserve">Dr. Manisha Khulbe</w:t>
       </w:r>
     </w:p>
     <w:p>
@@ -209,7 +209,7 @@
           <w:sz w:val="24"/>
           <w:szCs w:val="24"/>
         </w:rPr>
-        <w:t xml:space="preserve">Netaji Subhas University of Technology</w:t>
+        <w:t xml:space="preserve">Netaji Subhas University of Technology, East Campus</w:t>
       </w:r>
     </w:p>
     <w:p>
@@ -223,7 +223,7 @@
           <w:sz w:val="24"/>
           <w:szCs w:val="24"/>
         </w:rPr>
-        <w:t xml:space="preserve">Delhi, India</w:t>
+        <w:t xml:space="preserve">Geeta Colony, New Delhi - 110031</w:t>
       </w:r>
     </w:p>
     <w:p>
@@ -505,7 +505,7 @@
           <w:sz w:val="21"/>
           <w:szCs w:val="21"/>
         </w:rPr>
-        <w:t xml:space="preserve">Supervisor</w:t>
+        <w:t xml:space="preserve">Dr. Manisha Khulbe  (Supervisor)</w:t>
       </w:r>
       <w:r>
         <w:rPr>

</xml_diff>